<commit_message>
Deploying to gh-pages from @ VisruthSK/quarto-exercises@20c255148d770ecd7a3d2e538762b55caded3def 🚀
</commit_message>
<xml_diff>
--- a/example.docx
+++ b/example.docx
@@ -413,14 +413,6 @@
       </w:pPr>
       <w:r>
         <w:t xml:space="preserve">The One Ring was forged in ________.</w:t>
-      </w:r>
-    </w:p>
-    <w:p>
-      <w:pPr>
-        <w:pStyle w:val="BodyText"/>
-      </w:pPr>
-      <w:r>
-        <w:t xml:space="preserve">The literal token is ________.</w:t>
       </w:r>
     </w:p>
     <w:bookmarkEnd w:id="19"/>

</xml_diff>